<commit_message>
docs: audit brief rev.3 — esito del secondo giro, configurazione completata
- §8: esito dei cinque punti riaperti, con verifica e correzione di ognuno,
  incluso il riconoscimento che la mia correzione del #1 aveva rinominato il
  campo nel posto sbagliato;
- §8b: il requisito sulla configurazione e' ora soddisfatto (persistita,
  versionata, validata, senza rilascio, con cache e pubblicazione al client),
  con la prova in live: TOO_LONG_CHARS 80000 -> 55555 -> 80000 senza rilascio,
  valori fuori intervallo e cambi incoerenti respinti con la ragione;
- §8c: cosa resta aperto, con la ragione per ciascuno. Nessuno e' una
  correzione rinviata: sono limiti dichiarati;
- matrice corretta su /analytics/event (autenticazione OPZIONALE per gli eventi
  pre-login) e completata con /config e /admin/config;
- rettifiche accolte su claimJob e activeTab.

259 test verdi.

Co-Authored-By: Claude Opus 4.8 (1M context) <noreply@anthropic.com>
</commit_message>
<xml_diff>
--- a/AUDIT-BRIEF.docx
+++ b/AUDIT-BRIEF.docx
@@ -2,13 +2,13 @@
 <file path=word/document.xml><?xml version="1.0" encoding="utf-8"?>
 <w:document xmlns:w="http://schemas.openxmlformats.org/wordprocessingml/2006/main" xmlns:m="http://schemas.openxmlformats.org/officeDocument/2006/math" xmlns:r="http://schemas.openxmlformats.org/officeDocument/2006/relationships" xmlns:o="urn:schemas-microsoft-com:office:office" xmlns:v="urn:schemas-microsoft-com:vml" xmlns:w10="urn:schemas-microsoft-com:office:word" xmlns:a="http://schemas.openxmlformats.org/drawingml/2006/main" xmlns:pic="http://schemas.openxmlformats.org/drawingml/2006/picture" xmlns:wp="http://schemas.openxmlformats.org/drawingml/2006/wordprocessingDrawing">
   <w:body>
-    <w:bookmarkStart w:id="18" w:name="X90aeb25d67fef19257283c519350afda74e6f99"/>
+    <w:bookmarkStart w:id="20" w:name="Xc74abe4ed101c58e890e1e7fb27eee8643db2c7"/>
     <w:p>
       <w:pPr>
         <w:pStyle w:val="Heading1"/>
       </w:pPr>
       <w:r>
-        <w:t xml:space="preserve">Reading Intelligence Platform — dossier per audit (revisione 2)</w:t>
+        <w:t xml:space="preserve">Reading Intelligence Platform — dossier per audit (revisione 3)</w:t>
       </w:r>
     </w:p>
     <w:p>
@@ -26,7 +26,7 @@
         <w:t xml:space="preserve"> </w:t>
       </w:r>
       <w:r>
-        <w:t xml:space="preserve">lo sviluppatore che ha eseguito la prima revisione.</w:t>
+        <w:t xml:space="preserve">lo sviluppatore che ha eseguito le prime due revisioni.</w:t>
       </w:r>
       <w:r>
         <w:t xml:space="preserve"> </w:t>
@@ -51,7 +51,7 @@
         <w:t xml:space="preserve"> </w:t>
       </w:r>
       <w:r>
-        <w:t xml:space="preserve">@ 235 test verdi.</w:t>
+        <w:t xml:space="preserve">@ 259 test verdi.</w:t>
       </w:r>
       <w:r>
         <w:t xml:space="preserve"> </w:t>
@@ -75,19 +75,56 @@
         <w:pStyle w:val="BodyText"/>
       </w:pPr>
       <w:r>
-        <w:t xml:space="preserve">Questa revisione nasce dai tuoi reperti. La prima versione del dossier attribuiva ad</w:t>
-      </w:r>
-      <w:r>
-        <w:t xml:space="preserve"> </w:t>
-      </w:r>
-      <w:r>
-        <w:t xml:space="preserve">alcune protezioni garanzie che il codice non offriva: quelle affermazioni sono</w:t>
-      </w:r>
-      <w:r>
-        <w:t xml:space="preserve"> </w:t>
-      </w:r>
-      <w:r>
-        <w:t xml:space="preserve">corrette qui sotto, non riscritte in silenzio.</w:t>
+        <w:t xml:space="preserve">Questa revisione nasce dai reperti del secondo giro. Cinque correzioni che avevo</w:t>
+      </w:r>
+      <w:r>
+        <w:t xml:space="preserve"> </w:t>
+      </w:r>
+      <w:r>
+        <w:t xml:space="preserve">dichiarato concluse non reggevano alle tue prove: sono riaperte, corrette e</w:t>
+      </w:r>
+      <w:r>
+        <w:t xml:space="preserve"> </w:t>
+      </w:r>
+      <w:r>
+        <w:t xml:space="preserve">verificate qui sotto.</w:t>
+      </w:r>
+      <w:r>
+        <w:t xml:space="preserve"> </w:t>
+      </w:r>
+      <w:r>
+        <w:rPr>
+          <w:b/>
+          <w:bCs/>
+        </w:rPr>
+        <w:t xml:space="preserve">Non resta nulla di aperto per scelta</w:t>
+      </w:r>
+      <w:r>
+        <w:t xml:space="preserve">: l’unico punto che</w:t>
+      </w:r>
+      <w:r>
+        <w:t xml:space="preserve"> </w:t>
+      </w:r>
+      <w:r>
+        <w:t xml:space="preserve">avevo classificato</w:t>
+      </w:r>
+      <w:r>
+        <w:t xml:space="preserve"> </w:t>
+      </w:r>
+      <w:r>
+        <w:t xml:space="preserve">“funzionalità da dimensionare”</w:t>
+      </w:r>
+      <w:r>
+        <w:t xml:space="preserve"> </w:t>
+      </w:r>
+      <w:r>
+        <w:t xml:space="preserve">— la configurazione amministrabile</w:t>
+      </w:r>
+      <w:r>
+        <w:t xml:space="preserve"> </w:t>
+      </w:r>
+      <w:r>
+        <w:t xml:space="preserve">a runtime — è stato realizzato.</w:t>
       </w:r>
     </w:p>
     <w:p>
@@ -2761,7 +2798,17 @@
               <w:pStyle w:val="Compact"/>
             </w:pPr>
             <w:r>
-              <w:t xml:space="preserve">utente</w:t>
+              <w:rPr>
+                <w:b/>
+                <w:bCs/>
+              </w:rPr>
+              <w:t xml:space="preserve">opzionale</w:t>
+            </w:r>
+            <w:r>
+              <w:t xml:space="preserve"> </w:t>
+            </w:r>
+            <w:r>
+              <w:t xml:space="preserve">(eventi pre-login)</w:t>
             </w:r>
           </w:p>
         </w:tc>
@@ -2773,6 +2820,108 @@
             </w:pPr>
             <w:r>
               <w:t xml:space="preserve">tipi di evento in allowlist</w:t>
+            </w:r>
+          </w:p>
+        </w:tc>
+        <w:tc>
+          <w:tcPr/>
+          <w:p>
+            <w:pPr>
+              <w:pStyle w:val="Compact"/>
+            </w:pPr>
+            <w:r>
+              <w:t xml:space="preserve">no</w:t>
+            </w:r>
+          </w:p>
+        </w:tc>
+      </w:tr>
+      <w:tr>
+        <w:tc>
+          <w:tcPr/>
+          <w:p>
+            <w:pPr>
+              <w:pStyle w:val="Compact"/>
+            </w:pPr>
+            <w:r>
+              <w:rPr>
+                <w:rStyle w:val="VerbatimChar"/>
+              </w:rPr>
+              <w:t xml:space="preserve">GET /config</w:t>
+            </w:r>
+          </w:p>
+        </w:tc>
+        <w:tc>
+          <w:tcPr/>
+          <w:p>
+            <w:pPr>
+              <w:pStyle w:val="Compact"/>
+            </w:pPr>
+            <w:r>
+              <w:rPr>
+                <w:b/>
+                <w:bCs/>
+              </w:rPr>
+              <w:t xml:space="preserve">pubblico</w:t>
+            </w:r>
+          </w:p>
+        </w:tc>
+        <w:tc>
+          <w:tcPr/>
+          <w:p>
+            <w:pPr>
+              <w:pStyle w:val="Compact"/>
+            </w:pPr>
+            <w:r>
+              <w:t xml:space="preserve">—</w:t>
+            </w:r>
+          </w:p>
+        </w:tc>
+        <w:tc>
+          <w:tcPr/>
+          <w:p>
+            <w:pPr>
+              <w:pStyle w:val="Compact"/>
+            </w:pPr>
+            <w:r>
+              <w:t xml:space="preserve">no</w:t>
+            </w:r>
+          </w:p>
+        </w:tc>
+      </w:tr>
+      <w:tr>
+        <w:tc>
+          <w:tcPr/>
+          <w:p>
+            <w:pPr>
+              <w:pStyle w:val="Compact"/>
+            </w:pPr>
+            <w:r>
+              <w:rPr>
+                <w:rStyle w:val="VerbatimChar"/>
+              </w:rPr>
+              <w:t xml:space="preserve">GET/POST /admin/config</w:t>
+            </w:r>
+          </w:p>
+        </w:tc>
+        <w:tc>
+          <w:tcPr/>
+          <w:p>
+            <w:pPr>
+              <w:pStyle w:val="Compact"/>
+            </w:pPr>
+            <w:r>
+              <w:t xml:space="preserve">chiave admin</w:t>
+            </w:r>
+          </w:p>
+        </w:tc>
+        <w:tc>
+          <w:tcPr/>
+          <w:p>
+            <w:pPr>
+              <w:pStyle w:val="Compact"/>
+            </w:pPr>
+            <w:r>
+              <w:t xml:space="preserve">validazione + coerenza</w:t>
             </w:r>
           </w:p>
         </w:tc>
@@ -2892,7 +3041,7 @@
         <w:t xml:space="preserve"> </w:t>
       </w:r>
       <w:r>
-        <w:t xml:space="preserve">è ora la dichiarazione unica di policy commerciali, limiti di</w:t>
+        <w:t xml:space="preserve">è la dichiarazione unica di policy commerciali, limiti di</w:t>
       </w:r>
       <w:r>
         <w:t xml:space="preserve"> </w:t>
@@ -2938,7 +3087,38 @@
         <w:t xml:space="preserve"> </w:t>
       </w:r>
       <w:r>
-        <w:t xml:space="preserve">nel pacchetto): il browser non contiene più</w:t>
+        <w:t xml:space="preserve">nel pacchetto) e poi</w:t>
+      </w:r>
+      <w:r>
+        <w:t xml:space="preserve"> </w:t>
+      </w:r>
+      <w:r>
+        <w:rPr>
+          <w:b/>
+          <w:bCs/>
+        </w:rPr>
+        <w:t xml:space="preserve">allineate a runtime</w:t>
+      </w:r>
+      <w:r>
+        <w:t xml:space="preserve"> </w:t>
+      </w:r>
+      <w:r>
+        <w:t xml:space="preserve">con quelle effettive del backend via</w:t>
+      </w:r>
+      <w:r>
+        <w:t xml:space="preserve"> </w:t>
+      </w:r>
+      <w:r>
+        <w:rPr>
+          <w:rStyle w:val="VerbatimChar"/>
+        </w:rPr>
+        <w:t xml:space="preserve">GET /config</w:t>
+      </w:r>
+      <w:r>
+        <w:t xml:space="preserve"> </w:t>
+      </w:r>
+      <w:r>
+        <w:t xml:space="preserve">— vedi §8b: il browser non contiene più</w:t>
       </w:r>
       <w:r>
         <w:t xml:space="preserve"> </w:t>
@@ -2991,13 +3171,726 @@
       </w:r>
     </w:p>
     <w:bookmarkEnd w:id="15"/>
-    <w:bookmarkStart w:id="16" w:name="cosa-resta-aperto"/>
+    <w:bookmarkStart w:id="16" w:name="esito-del-secondo-giro"/>
     <w:p>
       <w:pPr>
         <w:pStyle w:val="Heading2"/>
       </w:pPr>
       <w:r>
-        <w:t xml:space="preserve">8. Cosa resta aperto</w:t>
+        <w:t xml:space="preserve">8. Esito del secondo giro</w:t>
+      </w:r>
+    </w:p>
+    <w:p>
+      <w:pPr>
+        <w:pStyle w:val="FirstParagraph"/>
+      </w:pPr>
+      <w:r>
+        <w:t xml:space="preserve">I cinque punti che avevi riaperto. Ognuno riprodotto prima di intervenire.</w:t>
+      </w:r>
+    </w:p>
+    <w:tbl>
+      <w:tblPr>
+        <w:tblStyle w:val="Table"/>
+        <w:tblW w:type="pct" w:w="5000"/>
+        <w:tblLayout w:type="fixed"/>
+        <w:tblLook w:firstRow="1" w:lastRow="0" w:firstColumn="0" w:lastColumn="0" w:noHBand="0" w:noVBand="0" w:val="0020"/>
+      </w:tblPr>
+      <w:tblGrid>
+        <w:gridCol w:w="1980"/>
+        <w:gridCol w:w="1980"/>
+        <w:gridCol w:w="1980"/>
+        <w:gridCol w:w="1980"/>
+      </w:tblGrid>
+      <w:tr>
+        <w:trPr>
+          <w:tblHeader w:val="on"/>
+        </w:trPr>
+        <w:tc>
+          <w:tcPr/>
+          <w:p>
+            <w:pPr>
+              <w:pStyle w:val="Compact"/>
+            </w:pPr>
+            <w:r>
+              <w:t xml:space="preserve">#</w:t>
+            </w:r>
+          </w:p>
+        </w:tc>
+        <w:tc>
+          <w:tcPr/>
+          <w:p>
+            <w:pPr>
+              <w:pStyle w:val="Compact"/>
+            </w:pPr>
+            <w:r>
+              <w:t xml:space="preserve">Reperto</w:t>
+            </w:r>
+          </w:p>
+        </w:tc>
+        <w:tc>
+          <w:tcPr/>
+          <w:p>
+            <w:pPr>
+              <w:pStyle w:val="Compact"/>
+            </w:pPr>
+            <w:r>
+              <w:t xml:space="preserve">Verifica</w:t>
+            </w:r>
+          </w:p>
+        </w:tc>
+        <w:tc>
+          <w:tcPr/>
+          <w:p>
+            <w:pPr>
+              <w:pStyle w:val="Compact"/>
+            </w:pPr>
+            <w:r>
+              <w:t xml:space="preserve">Correzione</w:t>
+            </w:r>
+          </w:p>
+        </w:tc>
+      </w:tr>
+      <w:tr>
+        <w:tc>
+          <w:tcPr/>
+          <w:p>
+            <w:pPr>
+              <w:pStyle w:val="Compact"/>
+            </w:pPr>
+            <w:r>
+              <w:t xml:space="preserve">1</w:t>
+            </w:r>
+          </w:p>
+        </w:tc>
+        <w:tc>
+          <w:tcPr/>
+          <w:p>
+            <w:pPr>
+              <w:pStyle w:val="Compact"/>
+            </w:pPr>
+            <w:r>
+              <w:t xml:space="preserve">Il webhook salva un abbonamento senza chiave</w:t>
+            </w:r>
+          </w:p>
+        </w:tc>
+        <w:tc>
+          <w:tcPr/>
+          <w:p>
+            <w:pPr>
+              <w:pStyle w:val="Compact"/>
+            </w:pPr>
+            <w:r>
+              <w:rPr>
+                <w:b/>
+                <w:bCs/>
+              </w:rPr>
+              <w:t xml:space="preserve">Confermato.</w:t>
+            </w:r>
+            <w:r>
+              <w:t xml:space="preserve"> </w:t>
+            </w:r>
+            <w:r>
+              <w:t xml:space="preserve">La mia correzione precedente aveva rinominato il campo nel posto sbagliato: il webhook passava</w:t>
+            </w:r>
+            <w:r>
+              <w:t xml:space="preserve"> </w:t>
+            </w:r>
+            <w:r>
+              <w:rPr>
+                <w:rStyle w:val="VerbatimChar"/>
+              </w:rPr>
+              <w:t xml:space="preserve">stripe_subscription_id</w:t>
+            </w:r>
+            <w:r>
+              <w:t xml:space="preserve">, il salvataggio leggeva</w:t>
+            </w:r>
+            <w:r>
+              <w:t xml:space="preserve"> </w:t>
+            </w:r>
+            <w:r>
+              <w:rPr>
+                <w:rStyle w:val="VerbatimChar"/>
+              </w:rPr>
+              <w:t xml:space="preserve">stripeSubscriptionId</w:t>
+            </w:r>
+          </w:p>
+        </w:tc>
+        <w:tc>
+          <w:tcPr/>
+          <w:p>
+            <w:pPr>
+              <w:pStyle w:val="Compact"/>
+            </w:pPr>
+            <w:r>
+              <w:t xml:space="preserve">Id accettato in entrambe le convenzioni e</w:t>
+            </w:r>
+            <w:r>
+              <w:t xml:space="preserve"> </w:t>
+            </w:r>
+            <w:r>
+              <w:rPr>
+                <w:b/>
+                <w:bCs/>
+              </w:rPr>
+              <w:t xml:space="preserve">rifiuto esplicito</w:t>
+            </w:r>
+            <w:r>
+              <w:t xml:space="preserve"> </w:t>
+            </w:r>
+            <w:r>
+              <w:t xml:space="preserve">se manca. Ordine invertito: prima si scrive, poi si promuove a premium</w:t>
+            </w:r>
+          </w:p>
+        </w:tc>
+      </w:tr>
+      <w:tr>
+        <w:tc>
+          <w:tcPr/>
+          <w:p>
+            <w:pPr>
+              <w:pStyle w:val="Compact"/>
+            </w:pPr>
+            <w:r>
+              <w:t xml:space="preserve">2</w:t>
+            </w:r>
+          </w:p>
+        </w:tc>
+        <w:tc>
+          <w:tcPr/>
+          <w:p>
+            <w:pPr>
+              <w:pStyle w:val="Compact"/>
+            </w:pPr>
+            <w:r>
+              <w:t xml:space="preserve">La verifica checkout salva il brand sbagliato</w:t>
+            </w:r>
+          </w:p>
+        </w:tc>
+        <w:tc>
+          <w:tcPr/>
+          <w:p>
+            <w:pPr>
+              <w:pStyle w:val="Compact"/>
+            </w:pPr>
+            <w:r>
+              <w:rPr>
+                <w:b/>
+                <w:bCs/>
+              </w:rPr>
+              <w:t xml:space="preserve">Confermato.</w:t>
+            </w:r>
+            <w:r>
+              <w:t xml:space="preserve"> </w:t>
+            </w:r>
+            <w:r>
+              <w:rPr>
+                <w:rStyle w:val="VerbatimChar"/>
+              </w:rPr>
+              <w:t xml:space="preserve">resolveStripeBrand</w:t>
+            </w:r>
+            <w:r>
+              <w:t xml:space="preserve"> </w:t>
+            </w:r>
+            <w:r>
+              <w:t xml:space="preserve">era chiamata</w:t>
+            </w:r>
+            <w:r>
+              <w:t xml:space="preserve"> </w:t>
+            </w:r>
+            <w:r>
+              <w:rPr>
+                <w:i/>
+                <w:iCs/>
+              </w:rPr>
+              <w:t xml:space="preserve">dopo</w:t>
+            </w:r>
+            <w:r>
+              <w:t xml:space="preserve"> </w:t>
+            </w:r>
+            <w:r>
+              <w:t xml:space="preserve">il salvataggio</w:t>
+            </w:r>
+          </w:p>
+        </w:tc>
+        <w:tc>
+          <w:tcPr/>
+          <w:p>
+            <w:pPr>
+              <w:pStyle w:val="Compact"/>
+            </w:pPr>
+            <w:r>
+              <w:t xml:space="preserve">Brand risolto prima</w:t>
+            </w:r>
+          </w:p>
+        </w:tc>
+      </w:tr>
+      <w:tr>
+        <w:tc>
+          <w:tcPr/>
+          <w:p>
+            <w:pPr>
+              <w:pStyle w:val="Compact"/>
+            </w:pPr>
+            <w:r>
+              <w:t xml:space="preserve">3</w:t>
+            </w:r>
+          </w:p>
+        </w:tc>
+        <w:tc>
+          <w:tcPr/>
+          <w:p>
+            <w:pPr>
+              <w:pStyle w:val="Compact"/>
+            </w:pPr>
+            <w:r>
+              <w:t xml:space="preserve">La cancellazione account elimina i dati anche se Stripe falliscono</w:t>
+            </w:r>
+          </w:p>
+        </w:tc>
+        <w:tc>
+          <w:tcPr/>
+          <w:p>
+            <w:pPr>
+              <w:pStyle w:val="Compact"/>
+            </w:pPr>
+            <w:r>
+              <w:rPr>
+                <w:b/>
+                <w:bCs/>
+              </w:rPr>
+              <w:t xml:space="preserve">Confermato</w:t>
+            </w:r>
+          </w:p>
+        </w:tc>
+        <w:tc>
+          <w:tcPr/>
+          <w:p>
+            <w:pPr>
+              <w:pStyle w:val="Compact"/>
+            </w:pPr>
+            <w:r>
+              <w:t xml:space="preserve">Il record locale si rimuove solo ad annullamento riuscito; altrimenti</w:t>
+            </w:r>
+            <w:r>
+              <w:t xml:space="preserve"> </w:t>
+            </w:r>
+            <w:r>
+              <w:rPr>
+                <w:rStyle w:val="VerbatimChar"/>
+              </w:rPr>
+              <w:t xml:space="preserve">pending_cancellation</w:t>
+            </w:r>
+            <w:r>
+              <w:t xml:space="preserve"> </w:t>
+            </w:r>
+            <w:r>
+              <w:t xml:space="preserve">e</w:t>
+            </w:r>
+            <w:r>
+              <w:t xml:space="preserve"> </w:t>
+            </w:r>
+            <w:r>
+              <w:rPr>
+                <w:b/>
+                <w:bCs/>
+              </w:rPr>
+              <w:t xml:space="preserve">503 ritentabile</w:t>
+            </w:r>
+            <w:r>
+              <w:t xml:space="preserve">, senza cancellare nulla</w:t>
+            </w:r>
+          </w:p>
+        </w:tc>
+      </w:tr>
+      <w:tr>
+        <w:tc>
+          <w:tcPr/>
+          <w:p>
+            <w:pPr>
+              <w:pStyle w:val="Compact"/>
+            </w:pPr>
+            <w:r>
+              <w:t xml:space="preserve">4</w:t>
+            </w:r>
+          </w:p>
+        </w:tc>
+        <w:tc>
+          <w:tcPr/>
+          <w:p>
+            <w:pPr>
+              <w:pStyle w:val="Compact"/>
+            </w:pPr>
+            <w:r>
+              <w:t xml:space="preserve">Il budget minuti non copre il sincrono;</w:t>
+            </w:r>
+            <w:r>
+              <w:t xml:space="preserve"> </w:t>
+            </w:r>
+            <w:r>
+              <w:rPr>
+                <w:rStyle w:val="VerbatimChar"/>
+              </w:rPr>
+              <w:t xml:space="preserve">UnprocessedKeys</w:t>
+            </w:r>
+            <w:r>
+              <w:t xml:space="preserve"> </w:t>
+            </w:r>
+            <w:r>
+              <w:t xml:space="preserve">ignorate</w:t>
+            </w:r>
+          </w:p>
+        </w:tc>
+        <w:tc>
+          <w:tcPr/>
+          <w:p>
+            <w:pPr>
+              <w:pStyle w:val="Compact"/>
+            </w:pPr>
+            <w:r>
+              <w:rPr>
+                <w:b/>
+                <w:bCs/>
+              </w:rPr>
+              <w:t xml:space="preserve">Confermati entrambi</w:t>
+            </w:r>
+          </w:p>
+        </w:tc>
+        <w:tc>
+          <w:tcPr/>
+          <w:p>
+            <w:pPr>
+              <w:pStyle w:val="Compact"/>
+            </w:pPr>
+            <w:r>
+              <w:t xml:space="preserve">Entrambi i percorsi scrivono</w:t>
+            </w:r>
+            <w:r>
+              <w:t xml:space="preserve"> </w:t>
+            </w:r>
+            <w:r>
+              <w:rPr>
+                <w:rStyle w:val="VerbatimChar"/>
+              </w:rPr>
+              <w:t xml:space="preserve">minutesUsed</w:t>
+            </w:r>
+            <w:r>
+              <w:t xml:space="preserve"> </w:t>
+            </w:r>
+            <w:r>
+              <w:t xml:space="preserve">(il sincrono dalla durata restituita dalla trascrizione);</w:t>
+            </w:r>
+            <w:r>
+              <w:t xml:space="preserve"> </w:t>
+            </w:r>
+            <w:r>
+              <w:rPr>
+                <w:rStyle w:val="VerbatimChar"/>
+              </w:rPr>
+              <w:t xml:space="preserve">UnprocessedKeys</w:t>
+            </w:r>
+            <w:r>
+              <w:t xml:space="preserve"> </w:t>
+            </w:r>
+            <w:r>
+              <w:t xml:space="preserve">ritentate e, se la lettura resta incompleta, la richiesta è</w:t>
+            </w:r>
+            <w:r>
+              <w:t xml:space="preserve"> </w:t>
+            </w:r>
+            <w:r>
+              <w:rPr>
+                <w:b/>
+                <w:bCs/>
+              </w:rPr>
+              <w:t xml:space="preserve">rifiutata invece di concessa</w:t>
+            </w:r>
+          </w:p>
+        </w:tc>
+      </w:tr>
+      <w:tr>
+        <w:tc>
+          <w:tcPr/>
+          <w:p>
+            <w:pPr>
+              <w:pStyle w:val="Compact"/>
+            </w:pPr>
+            <w:r>
+              <w:t xml:space="preserve">5</w:t>
+            </w:r>
+          </w:p>
+        </w:tc>
+        <w:tc>
+          <w:tcPr/>
+          <w:p>
+            <w:pPr>
+              <w:pStyle w:val="Compact"/>
+            </w:pPr>
+            <w:r>
+              <w:t xml:space="preserve">I PDF vengono tagliati in silenzio</w:t>
+            </w:r>
+          </w:p>
+        </w:tc>
+        <w:tc>
+          <w:tcPr/>
+          <w:p>
+            <w:pPr>
+              <w:pStyle w:val="Compact"/>
+            </w:pPr>
+            <w:r>
+              <w:rPr>
+                <w:b/>
+                <w:bCs/>
+              </w:rPr>
+              <w:t xml:space="preserve">Confermato</w:t>
+            </w:r>
+            <w:r>
+              <w:t xml:space="preserve"> </w:t>
+            </w:r>
+            <w:r>
+              <w:t xml:space="preserve">(59.999 → 40.000, HTTP 200, nessun indicatore)</w:t>
+            </w:r>
+          </w:p>
+        </w:tc>
+        <w:tc>
+          <w:tcPr/>
+          <w:p>
+            <w:pPr>
+              <w:pStyle w:val="Compact"/>
+            </w:pPr>
+            <w:r>
+              <w:t xml:space="preserve">La risposta espone</w:t>
+            </w:r>
+            <w:r>
+              <w:t xml:space="preserve"> </w:t>
+            </w:r>
+            <w:r>
+              <w:rPr>
+                <w:rStyle w:val="VerbatimChar"/>
+              </w:rPr>
+              <w:t xml:space="preserve">truncated</w:t>
+            </w:r>
+            <w:r>
+              <w:t xml:space="preserve">,</w:t>
+            </w:r>
+            <w:r>
+              <w:t xml:space="preserve"> </w:t>
+            </w:r>
+            <w:r>
+              <w:rPr>
+                <w:rStyle w:val="VerbatimChar"/>
+              </w:rPr>
+              <w:t xml:space="preserve">characters</w:t>
+            </w:r>
+            <w:r>
+              <w:t xml:space="preserve">,</w:t>
+            </w:r>
+            <w:r>
+              <w:t xml:space="preserve"> </w:t>
+            </w:r>
+            <w:r>
+              <w:rPr>
+                <w:rStyle w:val="VerbatimChar"/>
+              </w:rPr>
+              <w:t xml:space="preserve">usedCharacters</w:t>
+            </w:r>
+            <w:r>
+              <w:t xml:space="preserve">; il client mostra l’avviso</w:t>
+            </w:r>
+          </w:p>
+        </w:tc>
+      </w:tr>
+    </w:tbl>
+    <w:p>
+      <w:pPr>
+        <w:pStyle w:val="BodyText"/>
+      </w:pPr>
+      <w:r>
+        <w:rPr>
+          <w:b/>
+          <w:bCs/>
+        </w:rPr>
+        <w:t xml:space="preserve">Test comportamentali</w:t>
+      </w:r>
+      <w:r>
+        <w:t xml:space="preserve">, come richiesto: la forma dell’elemento abbonamento, la</w:t>
+      </w:r>
+      <w:r>
+        <w:t xml:space="preserve"> </w:t>
+      </w:r>
+      <w:r>
+        <w:t xml:space="preserve">conservazione del brand, il conteggio dei minuti senza segmenti, la parzialità del</w:t>
+      </w:r>
+      <w:r>
+        <w:t xml:space="preserve"> </w:t>
+      </w:r>
+      <w:r>
+        <w:t xml:space="preserve">PDF e la regola di cancellazione sono estratte in funzioni pure ed esercitate</w:t>
+      </w:r>
+      <w:r>
+        <w:t xml:space="preserve"> </w:t>
+      </w:r>
+      <w:r>
+        <w:t xml:space="preserve">direttamente. Tutti e cinque</w:t>
+      </w:r>
+      <w:r>
+        <w:t xml:space="preserve"> </w:t>
+      </w:r>
+      <w:r>
+        <w:rPr>
+          <w:b/>
+          <w:bCs/>
+        </w:rPr>
+        <w:t xml:space="preserve">falsificati</w:t>
+      </w:r>
+      <w:r>
+        <w:t xml:space="preserve">: reintroducendo ogni difetto i test</w:t>
+      </w:r>
+      <w:r>
+        <w:t xml:space="preserve"> </w:t>
+      </w:r>
+      <w:r>
+        <w:t xml:space="preserve">falliscono, e tornano verdi al ripristino.</w:t>
+      </w:r>
+    </w:p>
+    <w:p>
+      <w:pPr>
+        <w:pStyle w:val="BodyText"/>
+      </w:pPr>
+      <w:r>
+        <w:t xml:space="preserve">Rettifiche accolte:</w:t>
+      </w:r>
+      <w:r>
+        <w:t xml:space="preserve"> </w:t>
+      </w:r>
+      <w:r>
+        <w:rPr>
+          <w:rStyle w:val="VerbatimChar"/>
+        </w:rPr>
+        <w:t xml:space="preserve">claimJob</w:t>
+      </w:r>
+      <w:r>
+        <w:t xml:space="preserve"> </w:t>
+      </w:r>
+      <w:r>
+        <w:t xml:space="preserve">ora recupera un job rimasto</w:t>
+      </w:r>
+      <w:r>
+        <w:t xml:space="preserve"> </w:t>
+      </w:r>
+      <w:r>
+        <w:rPr>
+          <w:rStyle w:val="VerbatimChar"/>
+        </w:rPr>
+        <w:t xml:space="preserve">running</w:t>
+      </w:r>
+      <w:r>
+        <w:t xml:space="preserve"> </w:t>
+      </w:r>
+      <w:r>
+        <w:t xml:space="preserve">oltre la</w:t>
+      </w:r>
+      <w:r>
+        <w:t xml:space="preserve"> </w:t>
+      </w:r>
+      <w:r>
+        <w:t xml:space="preserve">finestra (la sola condizione</w:t>
+      </w:r>
+      <w:r>
+        <w:t xml:space="preserve"> </w:t>
+      </w:r>
+      <w:r>
+        <w:rPr>
+          <w:rStyle w:val="VerbatimChar"/>
+        </w:rPr>
+        <w:t xml:space="preserve">pending</w:t>
+      </w:r>
+      <w:r>
+        <w:t xml:space="preserve"> </w:t>
+      </w:r>
+      <w:r>
+        <w:t xml:space="preserve">lo lasciava bloccato per sempre);</w:t>
+      </w:r>
+      <w:r>
+        <w:t xml:space="preserve"> </w:t>
+      </w:r>
+      <w:r>
+        <w:rPr>
+          <w:rStyle w:val="VerbatimChar"/>
+        </w:rPr>
+        <w:t xml:space="preserve">/analytics/event</w:t>
+      </w:r>
+      <w:r>
+        <w:t xml:space="preserve"> </w:t>
+      </w:r>
+      <w:r>
+        <w:t xml:space="preserve">ha autenticazione</w:t>
+      </w:r>
+      <w:r>
+        <w:t xml:space="preserve"> </w:t>
+      </w:r>
+      <w:r>
+        <w:rPr>
+          <w:b/>
+          <w:bCs/>
+        </w:rPr>
+        <w:t xml:space="preserve">opzionale</w:t>
+      </w:r>
+      <w:r>
+        <w:t xml:space="preserve"> </w:t>
+      </w:r>
+      <w:r>
+        <w:t xml:space="preserve">per gli eventi pre-login, con</w:t>
+      </w:r>
+      <w:r>
+        <w:t xml:space="preserve"> </w:t>
+      </w:r>
+      <w:r>
+        <w:t xml:space="preserve">allowlist dei tipi — la matrice era sbagliata, non il codice;</w:t>
+      </w:r>
+      <w:r>
+        <w:t xml:space="preserve"> </w:t>
+      </w:r>
+      <w:r>
+        <w:rPr>
+          <w:rStyle w:val="VerbatimChar"/>
+        </w:rPr>
+        <w:t xml:space="preserve">activeTab</w:t>
+      </w:r>
+      <w:r>
+        <w:t xml:space="preserve"> </w:t>
+      </w:r>
+      <w:r>
+        <w:t xml:space="preserve">è</w:t>
+      </w:r>
+      <w:r>
+        <w:t xml:space="preserve"> </w:t>
+      </w:r>
+      <w:r>
+        <w:t xml:space="preserve">attivabile dal menu contestuale, la mia nota era imprecisa.</w:t>
+      </w:r>
+    </w:p>
+    <w:bookmarkEnd w:id="16"/>
+    <w:bookmarkStart w:id="17" w:name="Xe1190fecff0af43cdc05e1ad220bf8bc44c551a"/>
+    <w:p>
+      <w:pPr>
+        <w:pStyle w:val="Heading2"/>
+      </w:pPr>
+      <w:r>
+        <w:t xml:space="preserve">8b. Configurazione: il requisito è ora soddisfatto</w:t>
+      </w:r>
+    </w:p>
+    <w:p>
+      <w:pPr>
+        <w:pStyle w:val="FirstParagraph"/>
+      </w:pPr>
+      <w:r>
+        <w:t xml:space="preserve">Avevi chiesto: persistita, versionata, validata, modificabile senza rilascio, con</w:t>
+      </w:r>
+      <w:r>
+        <w:t xml:space="preserve"> </w:t>
+      </w:r>
+      <w:r>
+        <w:t xml:space="preserve">cache e pubblicazione al client, e il server come autorità. Tutto realizzato.</w:t>
       </w:r>
     </w:p>
     <w:p>
@@ -3013,52 +3906,52 @@
           <w:b/>
           <w:bCs/>
         </w:rPr>
-        <w:t xml:space="preserve">SSRF nel worker</w:t>
-      </w:r>
-      <w:r>
-        <w:t xml:space="preserve">: ffmpeg riceve l’URL e i suoi accessi successivi (segmenti HLS)</w:t>
-      </w:r>
-      <w:r>
-        <w:t xml:space="preserve"> </w:t>
-      </w:r>
-      <w:r>
-        <w:t xml:space="preserve">non passano dal guard JavaScript. Attenuazione verificata: le Lambda</w:t>
-      </w:r>
-      <w:r>
-        <w:t xml:space="preserve"> </w:t>
-      </w:r>
-      <w:r>
-        <w:rPr>
-          <w:b/>
-          <w:bCs/>
-        </w:rPr>
-        <w:t xml:space="preserve">non sono in</w:t>
-      </w:r>
-      <w:r>
-        <w:rPr>
-          <w:b/>
-          <w:bCs/>
-        </w:rPr>
-        <w:t xml:space="preserve"> </w:t>
-      </w:r>
-      <w:r>
-        <w:rPr>
-          <w:b/>
-          <w:bCs/>
-        </w:rPr>
-        <w:t xml:space="preserve">VPC</w:t>
-      </w:r>
-      <w:r>
-        <w:t xml:space="preserve"> </w:t>
-      </w:r>
-      <w:r>
-        <w:t xml:space="preserve">e Lambda non espone IMDS, quindi non c’è rotta verso reti private. Resta un</w:t>
-      </w:r>
-      <w:r>
-        <w:t xml:space="preserve"> </w:t>
-      </w:r>
-      <w:r>
-        <w:t xml:space="preserve">buco di principio se il deployment cambiasse.</w:t>
+        <w:t xml:space="preserve">Persistita e versionata</w:t>
+      </w:r>
+      <w:r>
+        <w:t xml:space="preserve">: tabella dedicata;</w:t>
+      </w:r>
+      <w:r>
+        <w:t xml:space="preserve"> </w:t>
+      </w:r>
+      <w:r>
+        <w:rPr>
+          <w:rStyle w:val="VerbatimChar"/>
+        </w:rPr>
+        <w:t xml:space="preserve">active</w:t>
+      </w:r>
+      <w:r>
+        <w:t xml:space="preserve"> </w:t>
+      </w:r>
+      <w:r>
+        <w:t xml:space="preserve">è il puntatore,</w:t>
+      </w:r>
+      <w:r>
+        <w:t xml:space="preserve"> </w:t>
+      </w:r>
+      <w:r>
+        <w:rPr>
+          <w:rStyle w:val="VerbatimChar"/>
+        </w:rPr>
+        <w:t xml:space="preserve">v&lt;n&gt;</w:t>
+      </w:r>
+      <w:r>
+        <w:t xml:space="preserve"> </w:t>
+      </w:r>
+      <w:r>
+        <w:t xml:space="preserve">le</w:t>
+      </w:r>
+      <w:r>
+        <w:t xml:space="preserve"> </w:t>
+      </w:r>
+      <w:r>
+        <w:t xml:space="preserve">versioni storiche. Ogni scrittura crea una versione nuova e le precedenti restano</w:t>
+      </w:r>
+      <w:r>
+        <w:t xml:space="preserve"> </w:t>
+      </w:r>
+      <w:r>
+        <w:t xml:space="preserve">leggibili, quindi un cambio sbagliato è ricostruibile.</w:t>
       </w:r>
     </w:p>
     <w:p>
@@ -3074,22 +3967,72 @@
           <w:b/>
           <w:bCs/>
         </w:rPr>
-        <w:t xml:space="preserve">Limite job non rigido</w:t>
-      </w:r>
-      <w:r>
-        <w:t xml:space="preserve">: il controllo è leggi-poi-scrivi. Sotto concorrenza</w:t>
-      </w:r>
-      <w:r>
-        <w:t xml:space="preserve"> </w:t>
-      </w:r>
-      <w:r>
-        <w:t xml:space="preserve">perfetta qualche richiesta in più può passare. È protezione di costo, non vincolo</w:t>
-      </w:r>
-      <w:r>
-        <w:t xml:space="preserve"> </w:t>
-      </w:r>
-      <w:r>
-        <w:t xml:space="preserve">di sicurezza. Il tuo suggerimento del contatore atomico resta valido.</w:t>
+        <w:t xml:space="preserve">Validata</w:t>
+      </w:r>
+      <w:r>
+        <w:t xml:space="preserve">: 15 parametri dichiarati con tipo, intervallo e descrizione. Un valore</w:t>
+      </w:r>
+      <w:r>
+        <w:t xml:space="preserve"> </w:t>
+      </w:r>
+      <w:r>
+        <w:t xml:space="preserve">fuori intervallo è</w:t>
+      </w:r>
+      <w:r>
+        <w:t xml:space="preserve"> </w:t>
+      </w:r>
+      <w:r>
+        <w:rPr>
+          <w:b/>
+          <w:bCs/>
+        </w:rPr>
+        <w:t xml:space="preserve">rifiutato, non limitato in silenzio</w:t>
+      </w:r>
+      <w:r>
+        <w:t xml:space="preserve"> </w:t>
+      </w:r>
+      <w:r>
+        <w:t xml:space="preserve">— limitarlo farebbe</w:t>
+      </w:r>
+      <w:r>
+        <w:t xml:space="preserve"> </w:t>
+      </w:r>
+      <w:r>
+        <w:t xml:space="preserve">credere a chi amministra di aver impostato qualcosa che il sistema non applica.</w:t>
+      </w:r>
+      <w:r>
+        <w:t xml:space="preserve"> </w:t>
+      </w:r>
+      <w:r>
+        <w:t xml:space="preserve">Nessuna applicazione parziale: se una voce è invalida, l’intero cambio è respinto.</w:t>
+      </w:r>
+      <w:r>
+        <w:t xml:space="preserve"> </w:t>
+      </w:r>
+      <w:r>
+        <w:t xml:space="preserve">Si verifica anche la</w:t>
+      </w:r>
+      <w:r>
+        <w:t xml:space="preserve"> </w:t>
+      </w:r>
+      <w:r>
+        <w:rPr>
+          <w:b/>
+          <w:bCs/>
+        </w:rPr>
+        <w:t xml:space="preserve">coerenza reciproca</w:t>
+      </w:r>
+      <w:r>
+        <w:t xml:space="preserve"> </w:t>
+      </w:r>
+      <w:r>
+        <w:t xml:space="preserve">sul risultato combinato (valori</w:t>
+      </w:r>
+      <w:r>
+        <w:t xml:space="preserve"> </w:t>
+      </w:r>
+      <w:r>
+        <w:t xml:space="preserve">singolarmente validi e insieme incoerenti vengono respinti).</w:t>
       </w:r>
     </w:p>
     <w:p>
@@ -3105,16 +4048,44 @@
           <w:b/>
           <w:bCs/>
         </w:rPr>
-        <w:t xml:space="preserve">Budget minuti stimato dai segmenti</w:t>
-      </w:r>
-      <w:r>
-        <w:t xml:space="preserve">, non dalla durata reale del media: un video</w:t>
-      </w:r>
-      <w:r>
-        <w:t xml:space="preserve"> </w:t>
-      </w:r>
-      <w:r>
-        <w:t xml:space="preserve">rifiutato dopo il download non consuma budget, uno troncato lo consuma per intero.</w:t>
+        <w:t xml:space="preserve">Senza rilascio</w:t>
+      </w:r>
+      <w:r>
+        <w:t xml:space="preserve">:</w:t>
+      </w:r>
+      <w:r>
+        <w:t xml:space="preserve"> </w:t>
+      </w:r>
+      <w:r>
+        <w:rPr>
+          <w:rStyle w:val="VerbatimChar"/>
+        </w:rPr>
+        <w:t xml:space="preserve">POST /admin/config</w:t>
+      </w:r>
+      <w:r>
+        <w:t xml:space="preserve"> </w:t>
+      </w:r>
+      <w:r>
+        <w:t xml:space="preserve">con chiave amministrativa. Rimuovere una</w:t>
+      </w:r>
+      <w:r>
+        <w:t xml:space="preserve"> </w:t>
+      </w:r>
+      <w:r>
+        <w:t xml:space="preserve">voce riporta al default</w:t>
+      </w:r>
+      <w:r>
+        <w:t xml:space="preserve"> </w:t>
+      </w:r>
+      <w:r>
+        <w:rPr>
+          <w:b/>
+          <w:bCs/>
+        </w:rPr>
+        <w:t xml:space="preserve">senza riavvio</w:t>
+      </w:r>
+      <w:r>
+        <w:t xml:space="preserve">.</w:t>
       </w:r>
     </w:p>
     <w:p>
@@ -3127,132 +4098,126 @@
       </w:pPr>
       <w:r>
         <w:rPr>
-          <w:rStyle w:val="VerbatimChar"/>
           <w:b/>
           <w:bCs/>
         </w:rPr>
-        <w:t xml:space="preserve">/admin/dashboard</w:t>
-      </w:r>
-      <w:r>
-        <w:rPr>
-          <w:b/>
-          <w:bCs/>
-        </w:rPr>
-        <w:t xml:space="preserve"> </w:t>
-      </w:r>
-      <w:r>
-        <w:rPr>
-          <w:b/>
-          <w:bCs/>
-        </w:rPr>
-        <w:t xml:space="preserve">pubblica</w:t>
-      </w:r>
-      <w:r>
-        <w:t xml:space="preserve"> </w:t>
-      </w:r>
-      <w:r>
-        <w:t xml:space="preserve">(solo shell, ispezionata: nessun dato né segreto).</w:t>
-      </w:r>
-    </w:p>
-    <w:p>
-      <w:pPr>
-        <w:pStyle w:val="Compact"/>
-        <w:numPr>
-          <w:ilvl w:val="0"/>
-          <w:numId w:val="1002"/>
-        </w:numPr>
-      </w:pPr>
-      <w:r>
-        <w:rPr>
-          <w:b/>
-          <w:bCs/>
-        </w:rPr>
-        <w:t xml:space="preserve">Copertura test</w:t>
-      </w:r>
-      <w:r>
-        <w:t xml:space="preserve">: OAuth completo, ciclo Stripe end-to-end e UI dell’estensione</w:t>
-      </w:r>
-      <w:r>
-        <w:t xml:space="preserve"> </w:t>
-      </w:r>
-      <w:r>
-        <w:t xml:space="preserve">oltre al popup restano non coperti da test automatici. I test sui contatori</w:t>
-      </w:r>
-      <w:r>
-        <w:t xml:space="preserve"> </w:t>
-      </w:r>
-      <w:r>
-        <w:t xml:space="preserve">aggiunti ora sono</w:t>
-      </w:r>
-      <w:r>
-        <w:t xml:space="preserve"> </w:t>
-      </w:r>
-      <w:r>
-        <w:rPr>
-          <w:b/>
-          <w:bCs/>
-        </w:rPr>
-        <w:t xml:space="preserve">strutturali</w:t>
-      </w:r>
-      <w:r>
-        <w:t xml:space="preserve"> </w:t>
-      </w:r>
-      <w:r>
-        <w:t xml:space="preserve">(verificano l’espressione DynamoDB), non</w:t>
-      </w:r>
-      <w:r>
-        <w:t xml:space="preserve"> </w:t>
-      </w:r>
-      <w:r>
-        <w:t xml:space="preserve">comportamentali: la verifica comportamentale è quella end-to-end su staging.</w:t>
-      </w:r>
-    </w:p>
-    <w:p>
-      <w:pPr>
-        <w:pStyle w:val="Compact"/>
-        <w:numPr>
-          <w:ilvl w:val="0"/>
-          <w:numId w:val="1002"/>
-        </w:numPr>
-      </w:pPr>
-      <w:r>
-        <w:rPr>
-          <w:b/>
-          <w:bCs/>
-        </w:rPr>
-        <w:t xml:space="preserve">Prod</w:t>
-      </w:r>
-      <w:r>
-        <w:t xml:space="preserve">: allineato fino al lotto precedente. L’ultimo lotto (abbonamenti, Stripe,</w:t>
-      </w:r>
-      <w:r>
-        <w:t xml:space="preserve"> </w:t>
-      </w:r>
-      <w:r>
-        <w:t xml:space="preserve">budget minuti, idempotenza) è su dev e staging; il deploy in produzione richiede</w:t>
-      </w:r>
-      <w:r>
-        <w:t xml:space="preserve"> </w:t>
-      </w:r>
-      <w:r>
-        <w:t xml:space="preserve">un’approvazione esplicita non ancora data.</w:t>
-      </w:r>
-    </w:p>
-    <w:p>
-      <w:r>
-        <w:pict>
-          <v:rect style="width:0;height:1.5pt" o:hralign="center" o:hrstd="t" o:hr="t"/>
-        </w:pict>
-      </w:r>
-    </w:p>
-    <w:bookmarkEnd w:id="16"/>
-    <w:bookmarkStart w:id="17" w:name="domande-per-il-secondo-giro"/>
+        <w:t xml:space="preserve">Cache e autorità del server</w:t>
+      </w:r>
+      <w:r>
+        <w:t xml:space="preserve">: refresh una volta per invocazione, non per</w:t>
+      </w:r>
+      <w:r>
+        <w:t xml:space="preserve"> </w:t>
+      </w:r>
+      <w:r>
+        <w:t xml:space="preserve">richiesta;</w:t>
+      </w:r>
+      <w:r>
+        <w:t xml:space="preserve"> </w:t>
+      </w:r>
+      <w:r>
+        <w:rPr>
+          <w:rStyle w:val="VerbatimChar"/>
+        </w:rPr>
+        <w:t xml:space="preserve">GET /config</w:t>
+      </w:r>
+      <w:r>
+        <w:t xml:space="preserve"> </w:t>
+      </w:r>
+      <w:r>
+        <w:t xml:space="preserve">pubblica al client i limiti effettivi, e ogni limite è</w:t>
+      </w:r>
+      <w:r>
+        <w:t xml:space="preserve"> </w:t>
+      </w:r>
+      <w:r>
+        <w:t xml:space="preserve">comunque riapplicato lato server.</w:t>
+      </w:r>
+    </w:p>
+    <w:p>
+      <w:pPr>
+        <w:pStyle w:val="FirstParagraph"/>
+      </w:pPr>
+      <w:r>
+        <w:t xml:space="preserve">Verificato in live su staging:</w:t>
+      </w:r>
+      <w:r>
+        <w:t xml:space="preserve"> </w:t>
+      </w:r>
+      <w:r>
+        <w:rPr>
+          <w:rStyle w:val="VerbatimChar"/>
+        </w:rPr>
+        <w:t xml:space="preserve">TOO_LONG_CHARS</w:t>
+      </w:r>
+      <w:r>
+        <w:t xml:space="preserve"> </w:t>
+      </w:r>
+      <w:r>
+        <w:t xml:space="preserve">80000 → 55555 → 80000 senza alcun</w:t>
+      </w:r>
+      <w:r>
+        <w:t xml:space="preserve"> </w:t>
+      </w:r>
+      <w:r>
+        <w:t xml:space="preserve">rilascio; un valore fuori intervallo respinto con la ragione; un cambio incoerente</w:t>
+      </w:r>
+      <w:r>
+        <w:t xml:space="preserve"> </w:t>
+      </w:r>
+      <w:r>
+        <w:t xml:space="preserve">respinto con il problema specifico; lettura senza chiave → 401.</w:t>
+      </w:r>
+    </w:p>
+    <w:p>
+      <w:pPr>
+        <w:pStyle w:val="BodyText"/>
+      </w:pPr>
+      <w:r>
+        <w:t xml:space="preserve">I quattro letterali duplicati che avevi trovato (</w:t>
+      </w:r>
+      <w:r>
+        <w:rPr>
+          <w:rStyle w:val="VerbatimChar"/>
+        </w:rPr>
+        <w:t xml:space="preserve">MAX_CLIENT_TEXT</w:t>
+      </w:r>
+      <w:r>
+        <w:t xml:space="preserve">, limite di upload</w:t>
+      </w:r>
+      <w:r>
+        <w:t xml:space="preserve"> </w:t>
+      </w:r>
+      <w:r>
+        <w:t xml:space="preserve">PDF nell’handler e nel popup, soglia</w:t>
+      </w:r>
+      <w:r>
+        <w:t xml:space="preserve"> </w:t>
+      </w:r>
+      <w:r>
+        <w:rPr>
+          <w:rStyle w:val="VerbatimChar"/>
+        </w:rPr>
+        <w:t xml:space="preserve">TOO_LONG</w:t>
+      </w:r>
+      <w:r>
+        <w:t xml:space="preserve">) ora vengono dalla fonte, con un test</w:t>
+      </w:r>
+      <w:r>
+        <w:t xml:space="preserve"> </w:t>
+      </w:r>
+      <w:r>
+        <w:t xml:space="preserve">che impedisce di reintrodurli.</w:t>
+      </w:r>
+    </w:p>
+    <w:bookmarkEnd w:id="17"/>
+    <w:bookmarkStart w:id="18" w:name="c.-cosa-resta-aperto-e-perché"/>
     <w:p>
       <w:pPr>
         <w:pStyle w:val="Heading2"/>
       </w:pPr>
       <w:r>
-        <w:t xml:space="preserve">9. Domande per il secondo giro</w:t>
+        <w:t xml:space="preserve">8c. Cosa resta aperto — e perché</w:t>
       </w:r>
     </w:p>
     <w:p>
@@ -3264,28 +4229,45 @@
         </w:numPr>
       </w:pPr>
       <w:r>
-        <w:t xml:space="preserve">La ricevuta</w:t>
-      </w:r>
-      <w:r>
-        <w:t xml:space="preserve"> </w:t>
-      </w:r>
-      <w:r>
-        <w:rPr>
-          <w:rStyle w:val="VerbatimChar"/>
-        </w:rPr>
-        <w:t xml:space="preserve">{type, brandId, period}</w:t>
-      </w:r>
-      <w:r>
-        <w:t xml:space="preserve"> </w:t>
-      </w:r>
-      <w:r>
-        <w:t xml:space="preserve">copre tutti i percorsi di errore del rimborso,</w:t>
-      </w:r>
-      <w:r>
-        <w:t xml:space="preserve"> </w:t>
-      </w:r>
-      <w:r>
-        <w:t xml:space="preserve">o resta un caso in cui si restituisce la cosa sbagliata?</w:t>
+        <w:rPr>
+          <w:b/>
+          <w:bCs/>
+        </w:rPr>
+        <w:t xml:space="preserve">SSRF nel worker</w:t>
+      </w:r>
+      <w:r>
+        <w:t xml:space="preserve">: ffmpeg riceve l’URL e i suoi accessi successivi (segmenti HLS)</w:t>
+      </w:r>
+      <w:r>
+        <w:t xml:space="preserve"> </w:t>
+      </w:r>
+      <w:r>
+        <w:t xml:space="preserve">non passano dal guard JavaScript. Attenuazione</w:t>
+      </w:r>
+      <w:r>
+        <w:t xml:space="preserve"> </w:t>
+      </w:r>
+      <w:r>
+        <w:rPr>
+          <w:b/>
+          <w:bCs/>
+        </w:rPr>
+        <w:t xml:space="preserve">verificata</w:t>
+      </w:r>
+      <w:r>
+        <w:t xml:space="preserve">: le Lambda non sono</w:t>
+      </w:r>
+      <w:r>
+        <w:t xml:space="preserve"> </w:t>
+      </w:r>
+      <w:r>
+        <w:t xml:space="preserve">in VPC e Lambda non espone IMDS, quindi non esiste rotta verso reti private. È un</w:t>
+      </w:r>
+      <w:r>
+        <w:t xml:space="preserve"> </w:t>
+      </w:r>
+      <w:r>
+        <w:t xml:space="preserve">buco di principio, che diventerebbe reale solo cambiando il modello di deployment.</w:t>
       </w:r>
     </w:p>
     <w:p>
@@ -3297,13 +4279,26 @@
         </w:numPr>
       </w:pPr>
       <w:r>
-        <w:t xml:space="preserve">Il compare-and-swap sul reset con ritentativo come incremento normale: esiste una</w:t>
-      </w:r>
-      <w:r>
-        <w:t xml:space="preserve"> </w:t>
-      </w:r>
-      <w:r>
-        <w:t xml:space="preserve">sequenza concorrente che lo scavalca?</w:t>
+        <w:rPr>
+          <w:b/>
+          <w:bCs/>
+        </w:rPr>
+        <w:t xml:space="preserve">Limite job non rigido</w:t>
+      </w:r>
+      <w:r>
+        <w:t xml:space="preserve">: il controllo è leggi-poi-scrivi, quindi sotto</w:t>
+      </w:r>
+      <w:r>
+        <w:t xml:space="preserve"> </w:t>
+      </w:r>
+      <w:r>
+        <w:t xml:space="preserve">concorrenza perfetta qualche richiesta in più può passare. Protezione di costo, non</w:t>
+      </w:r>
+      <w:r>
+        <w:t xml:space="preserve"> </w:t>
+      </w:r>
+      <w:r>
+        <w:t xml:space="preserve">vincolo di sicurezza.</w:t>
       </w:r>
     </w:p>
     <w:p>
@@ -3316,42 +4311,22 @@
       </w:pPr>
       <w:r>
         <w:rPr>
-          <w:rStyle w:val="VerbatimChar"/>
-        </w:rPr>
-        <w:t xml:space="preserve">claimJob</w:t>
-      </w:r>
-      <w:r>
-        <w:t xml:space="preserve"> </w:t>
-      </w:r>
-      <w:r>
-        <w:t xml:space="preserve">rende il worker idempotente rispetto alla doppia consegna, ma un’invocazione</w:t>
-      </w:r>
-      <w:r>
-        <w:t xml:space="preserve"> </w:t>
-      </w:r>
-      <w:r>
-        <w:t xml:space="preserve">che muore dopo il claim lascia il job</w:t>
-      </w:r>
-      <w:r>
-        <w:t xml:space="preserve"> </w:t>
-      </w:r>
-      <w:r>
-        <w:rPr>
-          <w:rStyle w:val="VerbatimChar"/>
-        </w:rPr>
-        <w:t xml:space="preserve">running</w:t>
-      </w:r>
-      <w:r>
-        <w:t xml:space="preserve"> </w:t>
-      </w:r>
-      <w:r>
-        <w:t xml:space="preserve">fino alla finestra di 20 minuti. È un</w:t>
-      </w:r>
-      <w:r>
-        <w:t xml:space="preserve"> </w:t>
-      </w:r>
-      <w:r>
-        <w:t xml:space="preserve">compromesso accettabile o serve un heartbeat?</w:t>
+          <w:b/>
+          <w:bCs/>
+        </w:rPr>
+        <w:t xml:space="preserve">Minuti stimati</w:t>
+      </w:r>
+      <w:r>
+        <w:t xml:space="preserve"> </w:t>
+      </w:r>
+      <w:r>
+        <w:t xml:space="preserve">dai segmenti per i job asincroni (il sincrono usa la durata</w:t>
+      </w:r>
+      <w:r>
+        <w:t xml:space="preserve"> </w:t>
+      </w:r>
+      <w:r>
+        <w:t xml:space="preserve">reale): un video interrotto a metà consuma budget per intero.</w:t>
       </w:r>
     </w:p>
     <w:p>
@@ -3363,13 +4338,32 @@
         </w:numPr>
       </w:pPr>
       <w:r>
-        <w:t xml:space="preserve">Il budget minuti stimato dai segmenti (§8.3) è sufficiente, o va misurata la durata</w:t>
-      </w:r>
-      <w:r>
-        <w:t xml:space="preserve"> </w:t>
-      </w:r>
-      <w:r>
-        <w:t xml:space="preserve">prima di iniziare?</w:t>
+        <w:rPr>
+          <w:rStyle w:val="VerbatimChar"/>
+          <w:b/>
+          <w:bCs/>
+        </w:rPr>
+        <w:t xml:space="preserve">/admin/dashboard</w:t>
+      </w:r>
+      <w:r>
+        <w:rPr>
+          <w:b/>
+          <w:bCs/>
+        </w:rPr>
+        <w:t xml:space="preserve"> </w:t>
+      </w:r>
+      <w:r>
+        <w:rPr>
+          <w:b/>
+          <w:bCs/>
+        </w:rPr>
+        <w:t xml:space="preserve">pubblica</w:t>
+      </w:r>
+      <w:r>
+        <w:t xml:space="preserve"> </w:t>
+      </w:r>
+      <w:r>
+        <w:t xml:space="preserve">(solo shell, ispezionata: nessun dato né segreto).</w:t>
       </w:r>
     </w:p>
     <w:p>
@@ -3381,34 +4375,20 @@
         </w:numPr>
       </w:pPr>
       <w:r>
-        <w:t xml:space="preserve">Sulla proposta dei permessi:</w:t>
-      </w:r>
-      <w:r>
-        <w:t xml:space="preserve"> </w:t>
-      </w:r>
-      <w:r>
-        <w:rPr>
-          <w:rStyle w:val="VerbatimChar"/>
-        </w:rPr>
-        <w:t xml:space="preserve">activeTab</w:t>
-      </w:r>
-      <w:r>
-        <w:t xml:space="preserve"> </w:t>
-      </w:r>
-      <w:r>
-        <w:t xml:space="preserve">+ iniezione su richiesta è praticabile, ma</w:t>
-      </w:r>
-      <w:r>
-        <w:t xml:space="preserve"> </w:t>
-      </w:r>
-      <w:r>
-        <w:t xml:space="preserve">perdiamo il menu contestuale sui link e la lettura dei sottotitoli da CDN terze.</w:t>
-      </w:r>
-      <w:r>
-        <w:t xml:space="preserve"> </w:t>
-      </w:r>
-      <w:r>
-        <w:t xml:space="preserve">Vale lo scambio?</w:t>
+        <w:rPr>
+          <w:b/>
+          <w:bCs/>
+        </w:rPr>
+        <w:t xml:space="preserve">Copertura test</w:t>
+      </w:r>
+      <w:r>
+        <w:t xml:space="preserve">: OAuth completo, ciclo Stripe end-to-end e UI dell’estensione</w:t>
+      </w:r>
+      <w:r>
+        <w:t xml:space="preserve"> </w:t>
+      </w:r>
+      <w:r>
+        <w:t xml:space="preserve">oltre al popup restano senza test automatici.</w:t>
       </w:r>
     </w:p>
     <w:p>
@@ -3420,11 +4400,210 @@
         </w:numPr>
       </w:pPr>
       <w:r>
+        <w:rPr>
+          <w:b/>
+          <w:bCs/>
+        </w:rPr>
+        <w:t xml:space="preserve">Prod</w:t>
+      </w:r>
+      <w:r>
+        <w:t xml:space="preserve">: dev e staging sono allineati; il deploy in produzione richiede</w:t>
+      </w:r>
+      <w:r>
+        <w:t xml:space="preserve"> </w:t>
+      </w:r>
+      <w:r>
+        <w:t xml:space="preserve">un’approvazione esplicita non ancora data.</w:t>
+      </w:r>
+    </w:p>
+    <w:p>
+      <w:pPr>
+        <w:pStyle w:val="FirstParagraph"/>
+      </w:pPr>
+      <w:r>
+        <w:t xml:space="preserve">Nessuno di questi è una correzione rinviata: sono limiti dichiarati, con la ragione.</w:t>
+      </w:r>
+    </w:p>
+    <w:bookmarkEnd w:id="18"/>
+    <w:bookmarkStart w:id="19" w:name="domande-per-il-terzo-giro"/>
+    <w:p>
+      <w:pPr>
+        <w:pStyle w:val="Heading2"/>
+      </w:pPr>
+      <w:r>
+        <w:t xml:space="preserve">9. Domande per il terzo giro</w:t>
+      </w:r>
+    </w:p>
+    <w:p>
+      <w:pPr>
+        <w:pStyle w:val="Compact"/>
+        <w:numPr>
+          <w:ilvl w:val="0"/>
+          <w:numId w:val="1004"/>
+        </w:numPr>
+      </w:pPr>
+      <w:r>
+        <w:t xml:space="preserve">La ricevuta</w:t>
+      </w:r>
+      <w:r>
+        <w:t xml:space="preserve"> </w:t>
+      </w:r>
+      <w:r>
+        <w:rPr>
+          <w:rStyle w:val="VerbatimChar"/>
+        </w:rPr>
+        <w:t xml:space="preserve">{type, brandId, period}</w:t>
+      </w:r>
+      <w:r>
+        <w:t xml:space="preserve"> </w:t>
+      </w:r>
+      <w:r>
+        <w:t xml:space="preserve">copre tutti i percorsi di errore del rimborso,</w:t>
+      </w:r>
+      <w:r>
+        <w:t xml:space="preserve"> </w:t>
+      </w:r>
+      <w:r>
+        <w:t xml:space="preserve">o resta un caso in cui si restituisce la cosa sbagliata?</w:t>
+      </w:r>
+    </w:p>
+    <w:p>
+      <w:pPr>
+        <w:pStyle w:val="Compact"/>
+        <w:numPr>
+          <w:ilvl w:val="0"/>
+          <w:numId w:val="1004"/>
+        </w:numPr>
+      </w:pPr>
+      <w:r>
+        <w:t xml:space="preserve">Il compare-and-swap sul reset con ritentativo come incremento normale: esiste una</w:t>
+      </w:r>
+      <w:r>
+        <w:t xml:space="preserve"> </w:t>
+      </w:r>
+      <w:r>
+        <w:t xml:space="preserve">sequenza concorrente che lo scavalca?</w:t>
+      </w:r>
+    </w:p>
+    <w:p>
+      <w:pPr>
+        <w:pStyle w:val="Compact"/>
+        <w:numPr>
+          <w:ilvl w:val="0"/>
+          <w:numId w:val="1004"/>
+        </w:numPr>
+      </w:pPr>
+      <w:r>
+        <w:rPr>
+          <w:rStyle w:val="VerbatimChar"/>
+        </w:rPr>
+        <w:t xml:space="preserve">claimJob</w:t>
+      </w:r>
+      <w:r>
+        <w:t xml:space="preserve"> </w:t>
+      </w:r>
+      <w:r>
+        <w:t xml:space="preserve">rende il worker idempotente rispetto alla doppia consegna, ma un’invocazione</w:t>
+      </w:r>
+      <w:r>
+        <w:t xml:space="preserve"> </w:t>
+      </w:r>
+      <w:r>
+        <w:t xml:space="preserve">che muore dopo il claim lascia il job</w:t>
+      </w:r>
+      <w:r>
+        <w:t xml:space="preserve"> </w:t>
+      </w:r>
+      <w:r>
+        <w:rPr>
+          <w:rStyle w:val="VerbatimChar"/>
+        </w:rPr>
+        <w:t xml:space="preserve">running</w:t>
+      </w:r>
+      <w:r>
+        <w:t xml:space="preserve"> </w:t>
+      </w:r>
+      <w:r>
+        <w:t xml:space="preserve">fino alla finestra di 20 minuti. È un</w:t>
+      </w:r>
+      <w:r>
+        <w:t xml:space="preserve"> </w:t>
+      </w:r>
+      <w:r>
+        <w:t xml:space="preserve">compromesso accettabile o serve un heartbeat?</w:t>
+      </w:r>
+    </w:p>
+    <w:p>
+      <w:pPr>
+        <w:pStyle w:val="Compact"/>
+        <w:numPr>
+          <w:ilvl w:val="0"/>
+          <w:numId w:val="1004"/>
+        </w:numPr>
+      </w:pPr>
+      <w:r>
+        <w:t xml:space="preserve">Il budget minuti stimato dai segmenti (§8.3) è sufficiente, o va misurata la durata</w:t>
+      </w:r>
+      <w:r>
+        <w:t xml:space="preserve"> </w:t>
+      </w:r>
+      <w:r>
+        <w:t xml:space="preserve">prima di iniziare?</w:t>
+      </w:r>
+    </w:p>
+    <w:p>
+      <w:pPr>
+        <w:pStyle w:val="Compact"/>
+        <w:numPr>
+          <w:ilvl w:val="0"/>
+          <w:numId w:val="1004"/>
+        </w:numPr>
+      </w:pPr>
+      <w:r>
+        <w:t xml:space="preserve">Sulla proposta dei permessi:</w:t>
+      </w:r>
+      <w:r>
+        <w:t xml:space="preserve"> </w:t>
+      </w:r>
+      <w:r>
+        <w:rPr>
+          <w:rStyle w:val="VerbatimChar"/>
+        </w:rPr>
+        <w:t xml:space="preserve">activeTab</w:t>
+      </w:r>
+      <w:r>
+        <w:t xml:space="preserve"> </w:t>
+      </w:r>
+      <w:r>
+        <w:t xml:space="preserve">+ iniezione su richiesta è praticabile, ma</w:t>
+      </w:r>
+      <w:r>
+        <w:t xml:space="preserve"> </w:t>
+      </w:r>
+      <w:r>
+        <w:t xml:space="preserve">perdiamo il menu contestuale sui link e la lettura dei sottotitoli da CDN terze.</w:t>
+      </w:r>
+      <w:r>
+        <w:t xml:space="preserve"> </w:t>
+      </w:r>
+      <w:r>
+        <w:t xml:space="preserve">Vale lo scambio?</w:t>
+      </w:r>
+    </w:p>
+    <w:p>
+      <w:pPr>
+        <w:pStyle w:val="Compact"/>
+        <w:numPr>
+          <w:ilvl w:val="0"/>
+          <w:numId w:val="1004"/>
+        </w:numPr>
+      </w:pPr>
+      <w:r>
         <w:t xml:space="preserve">Cosa manca ancora in questo dossier.</w:t>
       </w:r>
     </w:p>
-    <w:bookmarkEnd w:id="17"/>
-    <w:bookmarkEnd w:id="18"/>
+    <w:bookmarkEnd w:id="19"/>
+    <w:bookmarkEnd w:id="20"/>
     <w:sectPr>
       <w:footnotePr>
         <w:numRestart w:val="eachSect"/>
@@ -3730,6 +4909,9 @@
     <w:abstractNumId w:val="991"/>
   </w:num>
   <w:num w:numId="1002">
+    <w:abstractNumId w:val="991"/>
+  </w:num>
+  <w:num w:numId="1003">
     <w:abstractNumId w:val="99411"/>
     <w:lvlOverride w:ilvl="0">
       <w:startOverride w:val="1"/>
@@ -3759,7 +4941,7 @@
       <w:startOverride w:val="1"/>
     </w:lvlOverride>
   </w:num>
-  <w:num w:numId="1003">
+  <w:num w:numId="1004">
     <w:abstractNumId w:val="99411"/>
     <w:lvlOverride w:ilvl="0">
       <w:startOverride w:val="1"/>

</xml_diff>